<commit_message>
Updated cryptographic hash project report
Completed part IV
</commit_message>
<xml_diff>
--- a/Group49CRYPTHASH.docx
+++ b/Group49CRYPTHASH.docx
@@ -45,7 +45,7 @@
           <w:sz w:val="28"/>
           <w:szCs w:val="28"/>
         </w:rPr>
-        <w:t xml:space="preserve">Team: </w:t>
+        <w:t>Team: Lucie Spanbauer, Ashraf Mirza, Monish Sreekanth, K</w:t>
       </w:r>
       <w:r>
         <w:rPr>
@@ -55,7 +55,7 @@
           <w:sz w:val="28"/>
           <w:szCs w:val="28"/>
         </w:rPr>
-        <w:t>Lucie Spanbauer, Ashraf Mirza, Monish Sreekanth, Kmm9660</w:t>
+        <w:t>azi Mustakim</w:t>
       </w:r>
     </w:p>
     <w:p>
@@ -134,7 +134,21 @@
           <w:rFonts w:ascii="Times New Roman" w:hAnsi="Times New Roman" w:cs="Times New Roman"/>
         </w:rPr>
         <w:br/>
-        <w:t>A secure cryptographic hash has the avalanche effect: changing even one input bit is expected to change</w:t>
+        <w:t xml:space="preserve">A secure cryptographic hash has </w:t>
+      </w:r>
+      <w:proofErr w:type="gramStart"/>
+      <w:r>
+        <w:rPr>
+          <w:rFonts w:ascii="Times New Roman" w:hAnsi="Times New Roman" w:cs="Times New Roman"/>
+        </w:rPr>
+        <w:t>the</w:t>
+      </w:r>
+      <w:proofErr w:type="gramEnd"/>
+      <w:r>
+        <w:rPr>
+          <w:rFonts w:ascii="Times New Roman" w:hAnsi="Times New Roman" w:cs="Times New Roman"/>
+        </w:rPr>
+        <w:t xml:space="preserve"> avalanche effect: changing even one input bit is expected to change</w:t>
       </w:r>
       <w:r>
         <w:rPr>
@@ -146,7 +160,21 @@
         <w:rPr>
           <w:rFonts w:ascii="Times New Roman" w:hAnsi="Times New Roman" w:cs="Times New Roman"/>
         </w:rPr>
-        <w:t>about half of the output bits. Each parent hash then propagates the changed digest upward, making the root</w:t>
+        <w:t xml:space="preserve">about half of the output bits. Each parent </w:t>
+      </w:r>
+      <w:proofErr w:type="gramStart"/>
+      <w:r>
+        <w:rPr>
+          <w:rFonts w:ascii="Times New Roman" w:hAnsi="Times New Roman" w:cs="Times New Roman"/>
+        </w:rPr>
+        <w:t>hash</w:t>
+      </w:r>
+      <w:proofErr w:type="gramEnd"/>
+      <w:r>
+        <w:rPr>
+          <w:rFonts w:ascii="Times New Roman" w:hAnsi="Times New Roman" w:cs="Times New Roman"/>
+        </w:rPr>
+        <w:t xml:space="preserve"> then propagates the changed digest upward, making the root</w:t>
       </w:r>
       <w:r>
         <w:rPr>
@@ -357,29 +385,35 @@
           <w:b/>
           <w:bCs/>
         </w:rPr>
-        <w:t>P</w:t>
-      </w:r>
-      <w:r>
-        <w:rPr>
-          <w:rFonts w:ascii="Times New Roman" w:hAnsi="Times New Roman" w:cs="Times New Roman"/>
-          <w:b/>
-          <w:bCs/>
-        </w:rPr>
-        <w:t>art II — Hash Collisions and the Birthday Effect</w:t>
-      </w:r>
-      <w:r>
-        <w:rPr>
-          <w:rFonts w:ascii="Times New Roman" w:hAnsi="Times New Roman" w:cs="Times New Roman"/>
-          <w:b/>
-          <w:bCs/>
-        </w:rPr>
-        <w:br/>
-      </w:r>
-      <w:r>
-        <w:rPr>
-          <w:rFonts w:ascii="Times New Roman" w:hAnsi="Times New Roman" w:cs="Times New Roman"/>
-        </w:rPr>
-        <w:t>1. What are the minimum, maximum, and average attempts for each hash size?</w:t>
+        <w:t>Part II — Hash Collisions and the Birthday Effect</w:t>
+      </w:r>
+      <w:r>
+        <w:rPr>
+          <w:rFonts w:ascii="Times New Roman" w:hAnsi="Times New Roman" w:cs="Times New Roman"/>
+          <w:b/>
+          <w:bCs/>
+        </w:rPr>
+        <w:br/>
+      </w:r>
+      <w:r>
+        <w:rPr>
+          <w:rFonts w:ascii="Times New Roman" w:hAnsi="Times New Roman" w:cs="Times New Roman"/>
+        </w:rPr>
+        <w:t xml:space="preserve">1. What </w:t>
+      </w:r>
+      <w:proofErr w:type="gramStart"/>
+      <w:r>
+        <w:rPr>
+          <w:rFonts w:ascii="Times New Roman" w:hAnsi="Times New Roman" w:cs="Times New Roman"/>
+        </w:rPr>
+        <w:t>are</w:t>
+      </w:r>
+      <w:proofErr w:type="gramEnd"/>
+      <w:r>
+        <w:rPr>
+          <w:rFonts w:ascii="Times New Roman" w:hAnsi="Times New Roman" w:cs="Times New Roman"/>
+        </w:rPr>
+        <w:t xml:space="preserve"> the minimum, maximum, and average attempts for each hash size?</w:t>
       </w:r>
       <w:r>
         <w:rPr>
@@ -462,7 +496,21 @@
           <w:rFonts w:ascii="Times New Roman" w:hAnsi="Times New Roman" w:cs="Times New Roman"/>
         </w:rPr>
         <w:br/>
-        <w:t>approximately 1.177 × 2^(k/2). Thus collision counts are on the order of 2^(k/2), although individual trials vary.</w:t>
+        <w:t xml:space="preserve">approximately 1.177 × 2^(k/2). </w:t>
+      </w:r>
+      <w:proofErr w:type="gramStart"/>
+      <w:r>
+        <w:rPr>
+          <w:rFonts w:ascii="Times New Roman" w:hAnsi="Times New Roman" w:cs="Times New Roman"/>
+        </w:rPr>
+        <w:t>Thus</w:t>
+      </w:r>
+      <w:proofErr w:type="gramEnd"/>
+      <w:r>
+        <w:rPr>
+          <w:rFonts w:ascii="Times New Roman" w:hAnsi="Times New Roman" w:cs="Times New Roman"/>
+        </w:rPr>
+        <w:t xml:space="preserve"> collision counts are on the order of 2^(k/2), although individual trials vary.</w:t>
       </w:r>
       <w:r>
         <w:rPr>
@@ -569,7 +617,21 @@
         <w:rPr>
           <w:rFonts w:ascii="Times New Roman" w:hAnsi="Times New Roman" w:cs="Times New Roman"/>
         </w:rPr>
-        <w:t>statement about generic attacks and current knowledge, not a proof that SHA-256 can never be broken</w:t>
+        <w:t xml:space="preserve">statement about generic attacks and current knowledge, not </w:t>
+      </w:r>
+      <w:proofErr w:type="gramStart"/>
+      <w:r>
+        <w:rPr>
+          <w:rFonts w:ascii="Times New Roman" w:hAnsi="Times New Roman" w:cs="Times New Roman"/>
+        </w:rPr>
+        <w:t>a proof</w:t>
+      </w:r>
+      <w:proofErr w:type="gramEnd"/>
+      <w:r>
+        <w:rPr>
+          <w:rFonts w:ascii="Times New Roman" w:hAnsi="Times New Roman" w:cs="Times New Roman"/>
+        </w:rPr>
+        <w:t xml:space="preserve"> that SHA-256 can never be broken</w:t>
       </w:r>
       <w:r>
         <w:rPr>
@@ -631,13 +693,7 @@
         <w:rPr>
           <w:rFonts w:ascii="Times New Roman" w:hAnsi="Times New Roman" w:cs="Times New Roman"/>
         </w:rPr>
-        <w:t>1</w:t>
-      </w:r>
-      <w:r>
-        <w:rPr>
-          <w:rFonts w:ascii="Times New Roman" w:hAnsi="Times New Roman" w:cs="Times New Roman"/>
-        </w:rPr>
-        <w:t>. How does the amount of work change as the number of required zero bits increases?</w:t>
+        <w:t>1. How does the amount of work change as the number of required zero bits increases?</w:t>
       </w:r>
       <w:r>
         <w:rPr>
@@ -789,6 +845,1625 @@
         </w:rPr>
         <w:t>work does not make attacks impossible</w:t>
       </w:r>
+    </w:p>
+    <w:p>
+      <w:pPr>
+        <w:spacing w:after="0"/>
+        <w:rPr>
+          <w:rFonts w:ascii="Times New Roman" w:hAnsi="Times New Roman" w:cs="Times New Roman"/>
+        </w:rPr>
+      </w:pPr>
+    </w:p>
+    <w:p>
+      <w:pPr>
+        <w:spacing w:after="0"/>
+        <w:rPr>
+          <w:rFonts w:ascii="Times New Roman" w:hAnsi="Times New Roman" w:cs="Times New Roman"/>
+          <w:b/>
+          <w:bCs/>
+        </w:rPr>
+      </w:pPr>
+      <w:r>
+        <w:rPr>
+          <w:rFonts w:ascii="Times New Roman" w:hAnsi="Times New Roman" w:cs="Times New Roman"/>
+          <w:b/>
+          <w:bCs/>
+        </w:rPr>
+        <w:t>Part IV – Reflection: Cryptographic Hash and AI</w:t>
+      </w:r>
+    </w:p>
+    <w:p>
+      <w:pPr>
+        <w:spacing w:after="0"/>
+        <w:rPr>
+          <w:rFonts w:ascii="Times New Roman" w:hAnsi="Times New Roman" w:cs="Times New Roman"/>
+        </w:rPr>
+      </w:pPr>
+      <w:r>
+        <w:rPr>
+          <w:rFonts w:ascii="Times New Roman" w:hAnsi="Times New Roman" w:cs="Times New Roman"/>
+        </w:rPr>
+        <w:t>For this section, we used ChatGPT as the AI system. We asked the three questions required by the assignment and then evaluated the responses based on the cryptographic concepts covered in class and observed in our experiments.</w:t>
+      </w:r>
+    </w:p>
+    <w:p>
+      <w:pPr>
+        <w:spacing w:after="0"/>
+        <w:rPr>
+          <w:rFonts w:ascii="Times New Roman" w:hAnsi="Times New Roman" w:cs="Times New Roman"/>
+          <w:b/>
+          <w:bCs/>
+        </w:rPr>
+      </w:pPr>
+    </w:p>
+    <w:p>
+      <w:pPr>
+        <w:spacing w:after="0"/>
+        <w:rPr>
+          <w:rFonts w:ascii="Times New Roman" w:hAnsi="Times New Roman" w:cs="Times New Roman"/>
+          <w:b/>
+          <w:bCs/>
+        </w:rPr>
+      </w:pPr>
+      <w:r>
+        <w:rPr>
+          <w:rFonts w:ascii="Times New Roman" w:hAnsi="Times New Roman" w:cs="Times New Roman"/>
+          <w:b/>
+          <w:bCs/>
+        </w:rPr>
+        <w:t>4.1 AI Question 1 – Hash Collisions</w:t>
+      </w:r>
+    </w:p>
+    <w:p>
+      <w:pPr>
+        <w:spacing w:after="0"/>
+        <w:rPr>
+          <w:rFonts w:ascii="Times New Roman" w:hAnsi="Times New Roman" w:cs="Times New Roman"/>
+          <w:b/>
+          <w:bCs/>
+        </w:rPr>
+      </w:pPr>
+    </w:p>
+    <w:p>
+      <w:pPr>
+        <w:spacing w:after="0"/>
+        <w:rPr>
+          <w:rFonts w:ascii="Times New Roman" w:hAnsi="Times New Roman" w:cs="Times New Roman"/>
+        </w:rPr>
+      </w:pPr>
+      <w:r>
+        <w:rPr>
+          <w:rFonts w:ascii="Times New Roman" w:hAnsi="Times New Roman" w:cs="Times New Roman"/>
+          <w:b/>
+          <w:bCs/>
+        </w:rPr>
+        <w:t>Question:</w:t>
+      </w:r>
+      <w:r>
+        <w:rPr>
+          <w:rFonts w:ascii="Times New Roman" w:hAnsi="Times New Roman" w:cs="Times New Roman"/>
+        </w:rPr>
+        <w:br/>
+        <w:t>Why are collisions mathematically inevitable? Does this mean SHA-256 is insecure?</w:t>
+      </w:r>
+    </w:p>
+    <w:p>
+      <w:pPr>
+        <w:spacing w:after="0"/>
+        <w:rPr>
+          <w:rFonts w:ascii="Times New Roman" w:hAnsi="Times New Roman" w:cs="Times New Roman"/>
+        </w:rPr>
+      </w:pPr>
+      <w:r>
+        <w:rPr>
+          <w:rFonts w:ascii="Times New Roman" w:hAnsi="Times New Roman" w:cs="Times New Roman"/>
+          <w:b/>
+          <w:bCs/>
+        </w:rPr>
+        <w:t>AI Response:</w:t>
+      </w:r>
+      <w:r>
+        <w:rPr>
+          <w:rFonts w:ascii="Times New Roman" w:hAnsi="Times New Roman" w:cs="Times New Roman"/>
+        </w:rPr>
+        <w:br/>
+        <w:t xml:space="preserve">Collisions are mathematically inevitable because a hash function maps an unlimited number of </w:t>
+      </w:r>
+      <w:r>
+        <w:rPr>
+          <w:rFonts w:ascii="Times New Roman" w:hAnsi="Times New Roman" w:cs="Times New Roman"/>
+        </w:rPr>
+        <w:lastRenderedPageBreak/>
+        <w:t>possible inputs into a finite number of outputs. SHA-256 produces only (2^{256}) possible hash values, while the number of possible input messages is much larger. Therefore, by the pigeonhole principle, at least two different inputs must eventually produce the same hash.</w:t>
+      </w:r>
+    </w:p>
+    <w:p>
+      <w:pPr>
+        <w:spacing w:after="0"/>
+        <w:rPr>
+          <w:rFonts w:ascii="Times New Roman" w:hAnsi="Times New Roman" w:cs="Times New Roman"/>
+        </w:rPr>
+      </w:pPr>
+      <w:r>
+        <w:rPr>
+          <w:rFonts w:ascii="Times New Roman" w:hAnsi="Times New Roman" w:cs="Times New Roman"/>
+        </w:rPr>
+        <w:t xml:space="preserve">However, this does not mean SHA-256 is insecure. Security depends on how difficult it is to </w:t>
+      </w:r>
+      <w:r>
+        <w:rPr>
+          <w:rFonts w:ascii="Times New Roman" w:hAnsi="Times New Roman" w:cs="Times New Roman"/>
+        </w:rPr>
+        <w:t>find</w:t>
+      </w:r>
+      <w:r>
+        <w:rPr>
+          <w:rFonts w:ascii="Times New Roman" w:hAnsi="Times New Roman" w:cs="Times New Roman"/>
+        </w:rPr>
+        <w:t xml:space="preserve"> such a collision. For an ideal (n)-bit hash function, the birthday effect means that a generic collision attack requires approximately (2^{n/</w:t>
+      </w:r>
+      <w:proofErr w:type="gramStart"/>
+      <w:r>
+        <w:rPr>
+          <w:rFonts w:ascii="Times New Roman" w:hAnsi="Times New Roman" w:cs="Times New Roman"/>
+        </w:rPr>
+        <w:t>2})</w:t>
+      </w:r>
+      <w:proofErr w:type="gramEnd"/>
+      <w:r>
+        <w:rPr>
+          <w:rFonts w:ascii="Times New Roman" w:hAnsi="Times New Roman" w:cs="Times New Roman"/>
+        </w:rPr>
+        <w:t xml:space="preserve"> operations. For SHA-256, this is approximately:</w:t>
+      </w:r>
+    </w:p>
+    <w:p>
+      <w:pPr>
+        <w:spacing w:after="0"/>
+        <w:rPr>
+          <w:rFonts w:ascii="Times New Roman" w:hAnsi="Times New Roman" w:cs="Times New Roman"/>
+        </w:rPr>
+      </w:pPr>
+      <w:r>
+        <w:rPr>
+          <w:rFonts w:ascii="Times New Roman" w:hAnsi="Times New Roman" w:cs="Times New Roman"/>
+        </w:rPr>
+        <w:t>[</w:t>
+      </w:r>
+      <w:r>
+        <w:rPr>
+          <w:rFonts w:ascii="Times New Roman" w:hAnsi="Times New Roman" w:cs="Times New Roman"/>
+        </w:rPr>
+        <w:br/>
+        <w:t>2^{256/2}=2^{128}</w:t>
+      </w:r>
+      <w:r>
+        <w:rPr>
+          <w:rFonts w:ascii="Times New Roman" w:hAnsi="Times New Roman" w:cs="Times New Roman"/>
+        </w:rPr>
+        <w:br/>
+        <w:t>]</w:t>
+      </w:r>
+    </w:p>
+    <w:p>
+      <w:pPr>
+        <w:spacing w:after="0"/>
+        <w:rPr>
+          <w:rFonts w:ascii="Times New Roman" w:hAnsi="Times New Roman" w:cs="Times New Roman"/>
+        </w:rPr>
+      </w:pPr>
+      <w:r>
+        <w:rPr>
+          <w:rFonts w:ascii="Times New Roman" w:hAnsi="Times New Roman" w:cs="Times New Roman"/>
+        </w:rPr>
+        <w:t>hash operations.</w:t>
+      </w:r>
+    </w:p>
+    <w:p>
+      <w:pPr>
+        <w:spacing w:after="0"/>
+        <w:rPr>
+          <w:rFonts w:ascii="Times New Roman" w:hAnsi="Times New Roman" w:cs="Times New Roman"/>
+        </w:rPr>
+      </w:pPr>
+      <w:r>
+        <w:rPr>
+          <w:rFonts w:ascii="Times New Roman" w:hAnsi="Times New Roman" w:cs="Times New Roman"/>
+        </w:rPr>
+        <w:t>This amount of computation is considered infeasible with current computing resources. Therefore, collisions exist mathematically, but finding one efficiently is the important security question.</w:t>
+      </w:r>
+    </w:p>
+    <w:p>
+      <w:pPr>
+        <w:spacing w:after="0"/>
+        <w:rPr>
+          <w:rFonts w:ascii="Times New Roman" w:hAnsi="Times New Roman" w:cs="Times New Roman"/>
+          <w:b/>
+          <w:bCs/>
+        </w:rPr>
+      </w:pPr>
+    </w:p>
+    <w:p>
+      <w:pPr>
+        <w:spacing w:after="0"/>
+        <w:rPr>
+          <w:rFonts w:ascii="Times New Roman" w:hAnsi="Times New Roman" w:cs="Times New Roman"/>
+        </w:rPr>
+      </w:pPr>
+      <w:r>
+        <w:rPr>
+          <w:rFonts w:ascii="Times New Roman" w:hAnsi="Times New Roman" w:cs="Times New Roman"/>
+          <w:b/>
+          <w:bCs/>
+        </w:rPr>
+        <w:t>Follow-up Question:</w:t>
+      </w:r>
+      <w:r>
+        <w:rPr>
+          <w:rFonts w:ascii="Times New Roman" w:hAnsi="Times New Roman" w:cs="Times New Roman"/>
+        </w:rPr>
+        <w:br/>
+        <w:t xml:space="preserve">If collisions </w:t>
+      </w:r>
+      <w:proofErr w:type="gramStart"/>
+      <w:r>
+        <w:rPr>
+          <w:rFonts w:ascii="Times New Roman" w:hAnsi="Times New Roman" w:cs="Times New Roman"/>
+        </w:rPr>
+        <w:t>definitely exist</w:t>
+      </w:r>
+      <w:proofErr w:type="gramEnd"/>
+      <w:r>
+        <w:rPr>
+          <w:rFonts w:ascii="Times New Roman" w:hAnsi="Times New Roman" w:cs="Times New Roman"/>
+        </w:rPr>
+        <w:t>, why is approximately (2^{128}) work considered enough to make SHA-256 collision resistant?</w:t>
+      </w:r>
+    </w:p>
+    <w:p>
+      <w:pPr>
+        <w:spacing w:after="0"/>
+        <w:rPr>
+          <w:rFonts w:ascii="Times New Roman" w:hAnsi="Times New Roman" w:cs="Times New Roman"/>
+          <w:b/>
+          <w:bCs/>
+        </w:rPr>
+      </w:pPr>
+    </w:p>
+    <w:p>
+      <w:pPr>
+        <w:spacing w:after="0"/>
+        <w:rPr>
+          <w:rFonts w:ascii="Times New Roman" w:hAnsi="Times New Roman" w:cs="Times New Roman"/>
+        </w:rPr>
+      </w:pPr>
+      <w:r>
+        <w:rPr>
+          <w:rFonts w:ascii="Times New Roman" w:hAnsi="Times New Roman" w:cs="Times New Roman"/>
+          <w:b/>
+          <w:bCs/>
+        </w:rPr>
+        <w:t>AI Follow-up Response:</w:t>
+      </w:r>
+      <w:r>
+        <w:rPr>
+          <w:rFonts w:ascii="Times New Roman" w:hAnsi="Times New Roman" w:cs="Times New Roman"/>
+        </w:rPr>
+        <w:br/>
+        <w:t xml:space="preserve">The number (2^{128}) represents an extremely large search space. Even though the birthday effect reduces collision security from (2^{256}) to approximately (2^{128}), (2^{128}) operations </w:t>
+      </w:r>
+      <w:proofErr w:type="gramStart"/>
+      <w:r>
+        <w:rPr>
+          <w:rFonts w:ascii="Times New Roman" w:hAnsi="Times New Roman" w:cs="Times New Roman"/>
+        </w:rPr>
+        <w:t>is</w:t>
+      </w:r>
+      <w:proofErr w:type="gramEnd"/>
+      <w:r>
+        <w:rPr>
+          <w:rFonts w:ascii="Times New Roman" w:hAnsi="Times New Roman" w:cs="Times New Roman"/>
+        </w:rPr>
+        <w:t xml:space="preserve"> still far beyond practical computational capability. Therefore, the existence of collisions does not create a practical weakness unless an attacker can find them with significantly less work.</w:t>
+      </w:r>
+    </w:p>
+    <w:p>
+      <w:pPr>
+        <w:spacing w:after="0"/>
+        <w:rPr>
+          <w:rFonts w:ascii="Times New Roman" w:hAnsi="Times New Roman" w:cs="Times New Roman"/>
+          <w:b/>
+          <w:bCs/>
+        </w:rPr>
+      </w:pPr>
+    </w:p>
+    <w:p>
+      <w:pPr>
+        <w:spacing w:after="0"/>
+        <w:rPr>
+          <w:rFonts w:ascii="Times New Roman" w:hAnsi="Times New Roman" w:cs="Times New Roman"/>
+          <w:b/>
+          <w:bCs/>
+        </w:rPr>
+      </w:pPr>
+      <w:r>
+        <w:rPr>
+          <w:rFonts w:ascii="Times New Roman" w:hAnsi="Times New Roman" w:cs="Times New Roman"/>
+          <w:b/>
+          <w:bCs/>
+        </w:rPr>
+        <w:t>4.2 AI Question 2 – Merkle Trees</w:t>
+      </w:r>
+    </w:p>
+    <w:p>
+      <w:pPr>
+        <w:spacing w:after="0"/>
+        <w:rPr>
+          <w:rFonts w:ascii="Times New Roman" w:hAnsi="Times New Roman" w:cs="Times New Roman"/>
+          <w:b/>
+          <w:bCs/>
+        </w:rPr>
+      </w:pPr>
+    </w:p>
+    <w:p>
+      <w:pPr>
+        <w:spacing w:after="0"/>
+        <w:rPr>
+          <w:rFonts w:ascii="Times New Roman" w:hAnsi="Times New Roman" w:cs="Times New Roman"/>
+        </w:rPr>
+      </w:pPr>
+      <w:r>
+        <w:rPr>
+          <w:rFonts w:ascii="Times New Roman" w:hAnsi="Times New Roman" w:cs="Times New Roman"/>
+          <w:b/>
+          <w:bCs/>
+        </w:rPr>
+        <w:t>Question:</w:t>
+      </w:r>
+      <w:r>
+        <w:rPr>
+          <w:rFonts w:ascii="Times New Roman" w:hAnsi="Times New Roman" w:cs="Times New Roman"/>
+        </w:rPr>
+        <w:br/>
+        <w:t>How does a Merkle tree verify data integrity? What happens when the number of leaf nodes is odd?</w:t>
+      </w:r>
+    </w:p>
+    <w:p>
+      <w:pPr>
+        <w:spacing w:after="0"/>
+        <w:rPr>
+          <w:rFonts w:ascii="Times New Roman" w:hAnsi="Times New Roman" w:cs="Times New Roman"/>
+          <w:b/>
+          <w:bCs/>
+        </w:rPr>
+      </w:pPr>
+    </w:p>
+    <w:p>
+      <w:pPr>
+        <w:spacing w:after="0"/>
+        <w:rPr>
+          <w:rFonts w:ascii="Times New Roman" w:hAnsi="Times New Roman" w:cs="Times New Roman"/>
+        </w:rPr>
+      </w:pPr>
+      <w:r>
+        <w:rPr>
+          <w:rFonts w:ascii="Times New Roman" w:hAnsi="Times New Roman" w:cs="Times New Roman"/>
+          <w:b/>
+          <w:bCs/>
+        </w:rPr>
+        <w:t>AI Response:</w:t>
+      </w:r>
+      <w:r>
+        <w:rPr>
+          <w:rFonts w:ascii="Times New Roman" w:hAnsi="Times New Roman" w:cs="Times New Roman"/>
+        </w:rPr>
+        <w:br/>
+        <w:t>A Merkle tree verifies integrity by hashing each data item to create leaf nodes and then repeatedly hashing pairs of child hashes until a single Merkle root is produced.</w:t>
+      </w:r>
+    </w:p>
+    <w:p>
+      <w:pPr>
+        <w:spacing w:after="0"/>
+        <w:rPr>
+          <w:rFonts w:ascii="Times New Roman" w:hAnsi="Times New Roman" w:cs="Times New Roman"/>
+        </w:rPr>
+      </w:pPr>
+      <w:r>
+        <w:rPr>
+          <w:rFonts w:ascii="Times New Roman" w:hAnsi="Times New Roman" w:cs="Times New Roman"/>
+        </w:rPr>
+        <w:t>For example:</w:t>
+      </w:r>
+    </w:p>
+    <w:p>
+      <w:pPr>
+        <w:spacing w:after="0"/>
+        <w:rPr>
+          <w:rFonts w:ascii="Times New Roman" w:hAnsi="Times New Roman" w:cs="Times New Roman"/>
+        </w:rPr>
+      </w:pPr>
+      <w:r>
+        <w:rPr>
+          <w:rFonts w:ascii="Times New Roman" w:hAnsi="Times New Roman" w:cs="Times New Roman"/>
+        </w:rPr>
+        <w:t>[</w:t>
+      </w:r>
+      <w:r>
+        <w:rPr>
+          <w:rFonts w:ascii="Times New Roman" w:hAnsi="Times New Roman" w:cs="Times New Roman"/>
+        </w:rPr>
+        <w:br/>
+        <w:t>H_1=H(D_1),\</w:t>
+      </w:r>
+      <w:proofErr w:type="spellStart"/>
+      <w:r>
+        <w:rPr>
+          <w:rFonts w:ascii="Times New Roman" w:hAnsi="Times New Roman" w:cs="Times New Roman"/>
+        </w:rPr>
+        <w:t>qquad</w:t>
+      </w:r>
+      <w:proofErr w:type="spellEnd"/>
+      <w:r>
+        <w:rPr>
+          <w:rFonts w:ascii="Times New Roman" w:hAnsi="Times New Roman" w:cs="Times New Roman"/>
+        </w:rPr>
+        <w:t xml:space="preserve"> H_2=H(D_2)</w:t>
+      </w:r>
+      <w:r>
+        <w:rPr>
+          <w:rFonts w:ascii="Times New Roman" w:hAnsi="Times New Roman" w:cs="Times New Roman"/>
+        </w:rPr>
+        <w:br/>
+        <w:t>]</w:t>
+      </w:r>
+    </w:p>
+    <w:p>
+      <w:pPr>
+        <w:spacing w:after="0"/>
+        <w:rPr>
+          <w:rFonts w:ascii="Times New Roman" w:hAnsi="Times New Roman" w:cs="Times New Roman"/>
+        </w:rPr>
+      </w:pPr>
+      <w:r>
+        <w:rPr>
+          <w:rFonts w:ascii="Times New Roman" w:hAnsi="Times New Roman" w:cs="Times New Roman"/>
+        </w:rPr>
+        <w:t>The parent is calculated as:</w:t>
+      </w:r>
+    </w:p>
+    <w:p>
+      <w:pPr>
+        <w:spacing w:after="0"/>
+        <w:rPr>
+          <w:rFonts w:ascii="Times New Roman" w:hAnsi="Times New Roman" w:cs="Times New Roman"/>
+        </w:rPr>
+      </w:pPr>
+      <w:r>
+        <w:rPr>
+          <w:rFonts w:ascii="Times New Roman" w:hAnsi="Times New Roman" w:cs="Times New Roman"/>
+        </w:rPr>
+        <w:lastRenderedPageBreak/>
+        <w:t>[</w:t>
+      </w:r>
+      <w:r>
+        <w:rPr>
+          <w:rFonts w:ascii="Times New Roman" w:hAnsi="Times New Roman" w:cs="Times New Roman"/>
+        </w:rPr>
+        <w:br/>
+        <w:t>H_{12}=H(H_1\parallel H_2)</w:t>
+      </w:r>
+      <w:r>
+        <w:rPr>
+          <w:rFonts w:ascii="Times New Roman" w:hAnsi="Times New Roman" w:cs="Times New Roman"/>
+        </w:rPr>
+        <w:br/>
+        <w:t>]</w:t>
+      </w:r>
+    </w:p>
+    <w:p>
+      <w:pPr>
+        <w:spacing w:after="0"/>
+        <w:rPr>
+          <w:rFonts w:ascii="Times New Roman" w:hAnsi="Times New Roman" w:cs="Times New Roman"/>
+        </w:rPr>
+      </w:pPr>
+      <w:r>
+        <w:rPr>
+          <w:rFonts w:ascii="Times New Roman" w:hAnsi="Times New Roman" w:cs="Times New Roman"/>
+        </w:rPr>
+        <w:t>This process continues until the root hash is reached.</w:t>
+      </w:r>
+    </w:p>
+    <w:p>
+      <w:pPr>
+        <w:spacing w:after="0"/>
+        <w:rPr>
+          <w:rFonts w:ascii="Times New Roman" w:hAnsi="Times New Roman" w:cs="Times New Roman"/>
+        </w:rPr>
+      </w:pPr>
+      <w:r>
+        <w:rPr>
+          <w:rFonts w:ascii="Times New Roman" w:hAnsi="Times New Roman" w:cs="Times New Roman"/>
+        </w:rPr>
+        <w:t>If even a very small part of one file changes, its leaf hash changes. That change then affects every parent hash on the path from that leaf to the root. As a result, the final Merkle root becomes different. A stored or trusted Merkle root can therefore be compared with a newly calculated root to detect whether the underlying data has changed.</w:t>
+      </w:r>
+    </w:p>
+    <w:p>
+      <w:pPr>
+        <w:spacing w:after="0"/>
+        <w:rPr>
+          <w:rFonts w:ascii="Times New Roman" w:hAnsi="Times New Roman" w:cs="Times New Roman"/>
+        </w:rPr>
+      </w:pPr>
+      <w:r>
+        <w:rPr>
+          <w:rFonts w:ascii="Times New Roman" w:hAnsi="Times New Roman" w:cs="Times New Roman"/>
+        </w:rPr>
+        <w:t>If a level contains an odd number of nodes, the final node is duplicated and concatenated with itself before computing its parent. For example:</w:t>
+      </w:r>
+    </w:p>
+    <w:p>
+      <w:pPr>
+        <w:spacing w:after="0"/>
+        <w:rPr>
+          <w:rFonts w:ascii="Times New Roman" w:hAnsi="Times New Roman" w:cs="Times New Roman"/>
+        </w:rPr>
+      </w:pPr>
+      <w:r>
+        <w:rPr>
+          <w:rFonts w:ascii="Times New Roman" w:hAnsi="Times New Roman" w:cs="Times New Roman"/>
+        </w:rPr>
+        <w:t>[</w:t>
+      </w:r>
+      <w:r>
+        <w:rPr>
+          <w:rFonts w:ascii="Times New Roman" w:hAnsi="Times New Roman" w:cs="Times New Roman"/>
+        </w:rPr>
+        <w:br/>
+        <w:t>H_{55}=H(H_5\parallel H_5)</w:t>
+      </w:r>
+      <w:r>
+        <w:rPr>
+          <w:rFonts w:ascii="Times New Roman" w:hAnsi="Times New Roman" w:cs="Times New Roman"/>
+        </w:rPr>
+        <w:br/>
+        <w:t>]</w:t>
+      </w:r>
+    </w:p>
+    <w:p>
+      <w:pPr>
+        <w:spacing w:after="0"/>
+        <w:rPr>
+          <w:rFonts w:ascii="Times New Roman" w:hAnsi="Times New Roman" w:cs="Times New Roman"/>
+        </w:rPr>
+      </w:pPr>
+      <w:r>
+        <w:rPr>
+          <w:rFonts w:ascii="Times New Roman" w:hAnsi="Times New Roman" w:cs="Times New Roman"/>
+        </w:rPr>
+        <w:t>The same rule can be applied again at another level if necessary.</w:t>
+      </w:r>
+    </w:p>
+    <w:p>
+      <w:pPr>
+        <w:spacing w:after="0"/>
+        <w:rPr>
+          <w:rFonts w:ascii="Times New Roman" w:hAnsi="Times New Roman" w:cs="Times New Roman"/>
+          <w:b/>
+          <w:bCs/>
+        </w:rPr>
+      </w:pPr>
+    </w:p>
+    <w:p>
+      <w:pPr>
+        <w:spacing w:after="0"/>
+        <w:rPr>
+          <w:rFonts w:ascii="Times New Roman" w:hAnsi="Times New Roman" w:cs="Times New Roman"/>
+          <w:b/>
+          <w:bCs/>
+        </w:rPr>
+      </w:pPr>
+      <w:r>
+        <w:rPr>
+          <w:rFonts w:ascii="Times New Roman" w:hAnsi="Times New Roman" w:cs="Times New Roman"/>
+          <w:b/>
+          <w:bCs/>
+        </w:rPr>
+        <w:t>4.3 AI Question 3 – Proof-of-Work</w:t>
+      </w:r>
+    </w:p>
+    <w:p>
+      <w:pPr>
+        <w:spacing w:after="0"/>
+        <w:rPr>
+          <w:rFonts w:ascii="Times New Roman" w:hAnsi="Times New Roman" w:cs="Times New Roman"/>
+          <w:b/>
+          <w:bCs/>
+        </w:rPr>
+      </w:pPr>
+    </w:p>
+    <w:p>
+      <w:pPr>
+        <w:spacing w:after="0"/>
+        <w:rPr>
+          <w:rFonts w:ascii="Times New Roman" w:hAnsi="Times New Roman" w:cs="Times New Roman"/>
+        </w:rPr>
+      </w:pPr>
+      <w:r>
+        <w:rPr>
+          <w:rFonts w:ascii="Times New Roman" w:hAnsi="Times New Roman" w:cs="Times New Roman"/>
+          <w:b/>
+          <w:bCs/>
+        </w:rPr>
+        <w:t>Question:</w:t>
+      </w:r>
+      <w:r>
+        <w:rPr>
+          <w:rFonts w:ascii="Times New Roman" w:hAnsi="Times New Roman" w:cs="Times New Roman"/>
+        </w:rPr>
+        <w:br/>
+        <w:t>Why does finding a valid proof-of-work require substantial computation while verifying it is relatively easy? If miners use powerful computers to solve proof-of-work puzzles, why can't they simply calculate the correct nonce directly?</w:t>
+      </w:r>
+    </w:p>
+    <w:p>
+      <w:pPr>
+        <w:spacing w:after="0"/>
+        <w:rPr>
+          <w:rFonts w:ascii="Times New Roman" w:hAnsi="Times New Roman" w:cs="Times New Roman"/>
+          <w:b/>
+          <w:bCs/>
+        </w:rPr>
+      </w:pPr>
+    </w:p>
+    <w:p>
+      <w:pPr>
+        <w:spacing w:after="0"/>
+        <w:rPr>
+          <w:rFonts w:ascii="Times New Roman" w:hAnsi="Times New Roman" w:cs="Times New Roman"/>
+        </w:rPr>
+      </w:pPr>
+      <w:r>
+        <w:rPr>
+          <w:rFonts w:ascii="Times New Roman" w:hAnsi="Times New Roman" w:cs="Times New Roman"/>
+          <w:b/>
+          <w:bCs/>
+        </w:rPr>
+        <w:t>AI Response:</w:t>
+      </w:r>
+      <w:r>
+        <w:rPr>
+          <w:rFonts w:ascii="Times New Roman" w:hAnsi="Times New Roman" w:cs="Times New Roman"/>
+        </w:rPr>
+        <w:br/>
+        <w:t>A proof-of-work puzzle requires finding a nonce such that:</w:t>
+      </w:r>
+    </w:p>
+    <w:p>
+      <w:pPr>
+        <w:spacing w:after="0"/>
+        <w:rPr>
+          <w:rFonts w:ascii="Times New Roman" w:hAnsi="Times New Roman" w:cs="Times New Roman"/>
+        </w:rPr>
+      </w:pPr>
+      <w:r>
+        <w:rPr>
+          <w:rFonts w:ascii="Times New Roman" w:hAnsi="Times New Roman" w:cs="Times New Roman"/>
+        </w:rPr>
+        <w:t>[</w:t>
+      </w:r>
+      <w:r>
+        <w:rPr>
+          <w:rFonts w:ascii="Times New Roman" w:hAnsi="Times New Roman" w:cs="Times New Roman"/>
+        </w:rPr>
+        <w:br/>
+        <w:t>H(message\parallel nonce)</w:t>
+      </w:r>
+      <w:r>
+        <w:rPr>
+          <w:rFonts w:ascii="Times New Roman" w:hAnsi="Times New Roman" w:cs="Times New Roman"/>
+        </w:rPr>
+        <w:br/>
+        <w:t>]</w:t>
+      </w:r>
+    </w:p>
+    <w:p>
+      <w:pPr>
+        <w:spacing w:after="0"/>
+        <w:rPr>
+          <w:rFonts w:ascii="Times New Roman" w:hAnsi="Times New Roman" w:cs="Times New Roman"/>
+        </w:rPr>
+      </w:pPr>
+      <w:r>
+        <w:rPr>
+          <w:rFonts w:ascii="Times New Roman" w:hAnsi="Times New Roman" w:cs="Times New Roman"/>
+        </w:rPr>
+        <w:t xml:space="preserve">satisfies </w:t>
+      </w:r>
+      <w:proofErr w:type="gramStart"/>
+      <w:r>
+        <w:rPr>
+          <w:rFonts w:ascii="Times New Roman" w:hAnsi="Times New Roman" w:cs="Times New Roman"/>
+        </w:rPr>
+        <w:t>a required</w:t>
+      </w:r>
+      <w:proofErr w:type="gramEnd"/>
+      <w:r>
+        <w:rPr>
+          <w:rFonts w:ascii="Times New Roman" w:hAnsi="Times New Roman" w:cs="Times New Roman"/>
+        </w:rPr>
+        <w:t xml:space="preserve"> condition, such as beginning with a certain number of zero bits.</w:t>
+      </w:r>
+    </w:p>
+    <w:p>
+      <w:pPr>
+        <w:spacing w:after="0"/>
+        <w:rPr>
+          <w:rFonts w:ascii="Times New Roman" w:hAnsi="Times New Roman" w:cs="Times New Roman"/>
+        </w:rPr>
+      </w:pPr>
+      <w:r>
+        <w:rPr>
+          <w:rFonts w:ascii="Times New Roman" w:hAnsi="Times New Roman" w:cs="Times New Roman"/>
+        </w:rPr>
+        <w:t>Cryptographic hash functions are designed so that their outputs are unpredictable with respect to small input changes. Changing the nonce by even one value can produce a completely different hash. Therefore, there is no simple formula that tells a miner which nonce will create the required output.</w:t>
+      </w:r>
+    </w:p>
+    <w:p>
+      <w:pPr>
+        <w:spacing w:after="0"/>
+        <w:rPr>
+          <w:rFonts w:ascii="Times New Roman" w:hAnsi="Times New Roman" w:cs="Times New Roman"/>
+        </w:rPr>
+      </w:pPr>
+      <w:r>
+        <w:rPr>
+          <w:rFonts w:ascii="Times New Roman" w:hAnsi="Times New Roman" w:cs="Times New Roman"/>
+        </w:rPr>
+        <w:t>The miner must repeatedly try different nonce values:</w:t>
+      </w:r>
+    </w:p>
+    <w:p>
+      <w:pPr>
+        <w:spacing w:after="0"/>
+        <w:rPr>
+          <w:rFonts w:ascii="Times New Roman" w:hAnsi="Times New Roman" w:cs="Times New Roman"/>
+        </w:rPr>
+      </w:pPr>
+      <w:r>
+        <w:rPr>
+          <w:rFonts w:ascii="Times New Roman" w:hAnsi="Times New Roman" w:cs="Times New Roman"/>
+        </w:rPr>
+        <w:t>[</w:t>
+      </w:r>
+      <w:r>
+        <w:rPr>
+          <w:rFonts w:ascii="Times New Roman" w:hAnsi="Times New Roman" w:cs="Times New Roman"/>
+        </w:rPr>
+        <w:br/>
+        <w:t>nonce=0,1,2,3,\</w:t>
+      </w:r>
+      <w:proofErr w:type="spellStart"/>
+      <w:r>
+        <w:rPr>
+          <w:rFonts w:ascii="Times New Roman" w:hAnsi="Times New Roman" w:cs="Times New Roman"/>
+        </w:rPr>
+        <w:t>ldots</w:t>
+      </w:r>
+      <w:proofErr w:type="spellEnd"/>
+      <w:r>
+        <w:rPr>
+          <w:rFonts w:ascii="Times New Roman" w:hAnsi="Times New Roman" w:cs="Times New Roman"/>
+        </w:rPr>
+        <w:br/>
+        <w:t>]</w:t>
+      </w:r>
+    </w:p>
+    <w:p>
+      <w:pPr>
+        <w:spacing w:after="0"/>
+        <w:rPr>
+          <w:rFonts w:ascii="Times New Roman" w:hAnsi="Times New Roman" w:cs="Times New Roman"/>
+        </w:rPr>
+      </w:pPr>
+      <w:r>
+        <w:rPr>
+          <w:rFonts w:ascii="Times New Roman" w:hAnsi="Times New Roman" w:cs="Times New Roman"/>
+        </w:rPr>
+        <w:t>and calculate a new hash each time until one satisfies the required condition.</w:t>
+      </w:r>
+    </w:p>
+    <w:p>
+      <w:pPr>
+        <w:spacing w:after="0"/>
+        <w:rPr>
+          <w:rFonts w:ascii="Times New Roman" w:hAnsi="Times New Roman" w:cs="Times New Roman"/>
+        </w:rPr>
+      </w:pPr>
+      <w:r>
+        <w:rPr>
+          <w:rFonts w:ascii="Times New Roman" w:hAnsi="Times New Roman" w:cs="Times New Roman"/>
+        </w:rPr>
+        <w:t>If (d) zero bits are required, a random hash satisfies the condition with probability approximately:</w:t>
+      </w:r>
+    </w:p>
+    <w:p>
+      <w:pPr>
+        <w:spacing w:after="0"/>
+        <w:rPr>
+          <w:rFonts w:ascii="Times New Roman" w:hAnsi="Times New Roman" w:cs="Times New Roman"/>
+        </w:rPr>
+      </w:pPr>
+      <w:r>
+        <w:rPr>
+          <w:rFonts w:ascii="Times New Roman" w:hAnsi="Times New Roman" w:cs="Times New Roman"/>
+        </w:rPr>
+        <w:lastRenderedPageBreak/>
+        <w:t>[</w:t>
+      </w:r>
+      <w:r>
+        <w:rPr>
+          <w:rFonts w:ascii="Times New Roman" w:hAnsi="Times New Roman" w:cs="Times New Roman"/>
+        </w:rPr>
+        <w:br/>
+        <w:t>\frac{1}{2^d}</w:t>
+      </w:r>
+      <w:r>
+        <w:rPr>
+          <w:rFonts w:ascii="Times New Roman" w:hAnsi="Times New Roman" w:cs="Times New Roman"/>
+        </w:rPr>
+        <w:br/>
+        <w:t>]</w:t>
+      </w:r>
+    </w:p>
+    <w:p>
+      <w:pPr>
+        <w:spacing w:after="0"/>
+        <w:rPr>
+          <w:rFonts w:ascii="Times New Roman" w:hAnsi="Times New Roman" w:cs="Times New Roman"/>
+        </w:rPr>
+      </w:pPr>
+      <w:r>
+        <w:rPr>
+          <w:rFonts w:ascii="Times New Roman" w:hAnsi="Times New Roman" w:cs="Times New Roman"/>
+        </w:rPr>
+        <w:t>Therefore, the expected number of attempts is approximately:</w:t>
+      </w:r>
+    </w:p>
+    <w:p>
+      <w:pPr>
+        <w:spacing w:after="0"/>
+        <w:rPr>
+          <w:rFonts w:ascii="Times New Roman" w:hAnsi="Times New Roman" w:cs="Times New Roman"/>
+        </w:rPr>
+      </w:pPr>
+      <w:r>
+        <w:rPr>
+          <w:rFonts w:ascii="Times New Roman" w:hAnsi="Times New Roman" w:cs="Times New Roman"/>
+        </w:rPr>
+        <w:t>[</w:t>
+      </w:r>
+      <w:r>
+        <w:rPr>
+          <w:rFonts w:ascii="Times New Roman" w:hAnsi="Times New Roman" w:cs="Times New Roman"/>
+        </w:rPr>
+        <w:br/>
+        <w:t>2^d</w:t>
+      </w:r>
+      <w:r>
+        <w:rPr>
+          <w:rFonts w:ascii="Times New Roman" w:hAnsi="Times New Roman" w:cs="Times New Roman"/>
+        </w:rPr>
+        <w:br/>
+        <w:t>]</w:t>
+      </w:r>
+    </w:p>
+    <w:p>
+      <w:pPr>
+        <w:spacing w:after="0"/>
+        <w:rPr>
+          <w:rFonts w:ascii="Times New Roman" w:hAnsi="Times New Roman" w:cs="Times New Roman"/>
+        </w:rPr>
+      </w:pPr>
+      <w:r>
+        <w:rPr>
+          <w:rFonts w:ascii="Times New Roman" w:hAnsi="Times New Roman" w:cs="Times New Roman"/>
+        </w:rPr>
+        <w:t>Once a valid nonce has been found, verification is easy. Another participant only needs to compute the hash once using the submitted message and nonce and check whether the output satisfies the requirement.</w:t>
+      </w:r>
+    </w:p>
+    <w:p>
+      <w:pPr>
+        <w:spacing w:after="0"/>
+        <w:rPr>
+          <w:rFonts w:ascii="Times New Roman" w:hAnsi="Times New Roman" w:cs="Times New Roman"/>
+        </w:rPr>
+      </w:pPr>
+      <w:r>
+        <w:rPr>
+          <w:rFonts w:ascii="Times New Roman" w:hAnsi="Times New Roman" w:cs="Times New Roman"/>
+        </w:rPr>
+        <w:t>For example, a 20-bit zero-prefix puzzle has expected work of:</w:t>
+      </w:r>
+    </w:p>
+    <w:p>
+      <w:pPr>
+        <w:spacing w:after="0"/>
+        <w:rPr>
+          <w:rFonts w:ascii="Times New Roman" w:hAnsi="Times New Roman" w:cs="Times New Roman"/>
+        </w:rPr>
+      </w:pPr>
+      <w:r>
+        <w:rPr>
+          <w:rFonts w:ascii="Times New Roman" w:hAnsi="Times New Roman" w:cs="Times New Roman"/>
+        </w:rPr>
+        <w:t>[</w:t>
+      </w:r>
+      <w:r>
+        <w:rPr>
+          <w:rFonts w:ascii="Times New Roman" w:hAnsi="Times New Roman" w:cs="Times New Roman"/>
+        </w:rPr>
+        <w:br/>
+        <w:t>2^{20}=1,048,576</w:t>
+      </w:r>
+      <w:r>
+        <w:rPr>
+          <w:rFonts w:ascii="Times New Roman" w:hAnsi="Times New Roman" w:cs="Times New Roman"/>
+        </w:rPr>
+        <w:br/>
+        <w:t>]</w:t>
+      </w:r>
+    </w:p>
+    <w:p>
+      <w:pPr>
+        <w:spacing w:after="0"/>
+        <w:rPr>
+          <w:rFonts w:ascii="Times New Roman" w:hAnsi="Times New Roman" w:cs="Times New Roman"/>
+        </w:rPr>
+      </w:pPr>
+      <w:r>
+        <w:rPr>
+          <w:rFonts w:ascii="Times New Roman" w:hAnsi="Times New Roman" w:cs="Times New Roman"/>
+        </w:rPr>
+        <w:t>attempts, while verification requires only one hash calculation.</w:t>
+      </w:r>
+    </w:p>
+    <w:p>
+      <w:pPr>
+        <w:spacing w:after="0"/>
+        <w:rPr>
+          <w:rFonts w:ascii="Times New Roman" w:hAnsi="Times New Roman" w:cs="Times New Roman"/>
+        </w:rPr>
+      </w:pPr>
+    </w:p>
+    <w:p>
+      <w:pPr>
+        <w:spacing w:after="0"/>
+        <w:rPr>
+          <w:rFonts w:ascii="Times New Roman" w:hAnsi="Times New Roman" w:cs="Times New Roman"/>
+          <w:b/>
+          <w:bCs/>
+        </w:rPr>
+      </w:pPr>
+      <w:r>
+        <w:rPr>
+          <w:rFonts w:ascii="Times New Roman" w:hAnsi="Times New Roman" w:cs="Times New Roman"/>
+          <w:b/>
+          <w:bCs/>
+        </w:rPr>
+        <w:t>4.4 Evaluation of the AI Explanation</w:t>
+      </w:r>
+    </w:p>
+    <w:p>
+      <w:pPr>
+        <w:spacing w:after="0"/>
+        <w:rPr>
+          <w:rFonts w:ascii="Times New Roman" w:hAnsi="Times New Roman" w:cs="Times New Roman"/>
+          <w:b/>
+          <w:bCs/>
+        </w:rPr>
+      </w:pPr>
+    </w:p>
+    <w:p>
+      <w:pPr>
+        <w:spacing w:after="0"/>
+        <w:rPr>
+          <w:rFonts w:ascii="Times New Roman" w:hAnsi="Times New Roman" w:cs="Times New Roman"/>
+          <w:b/>
+          <w:bCs/>
+        </w:rPr>
+      </w:pPr>
+      <w:r>
+        <w:rPr>
+          <w:rFonts w:ascii="Times New Roman" w:hAnsi="Times New Roman" w:cs="Times New Roman"/>
+          <w:b/>
+          <w:bCs/>
+        </w:rPr>
+        <w:t>1. Was the explanation correct and clear? Identify any mistakes or oversimplifications.</w:t>
+      </w:r>
+    </w:p>
+    <w:p>
+      <w:pPr>
+        <w:spacing w:after="0"/>
+        <w:rPr>
+          <w:rFonts w:ascii="Times New Roman" w:hAnsi="Times New Roman" w:cs="Times New Roman"/>
+        </w:rPr>
+      </w:pPr>
+      <w:r>
+        <w:rPr>
+          <w:rFonts w:ascii="Times New Roman" w:hAnsi="Times New Roman" w:cs="Times New Roman"/>
+        </w:rPr>
+        <w:t xml:space="preserve">Overall, the AI explanations were correct and consistent with the concepts covered in class and demonstrated in our experiments. The explanation of collisions </w:t>
+      </w:r>
+      <w:proofErr w:type="gramStart"/>
+      <w:r>
+        <w:rPr>
+          <w:rFonts w:ascii="Times New Roman" w:hAnsi="Times New Roman" w:cs="Times New Roman"/>
+        </w:rPr>
+        <w:t>correctly</w:t>
+      </w:r>
+      <w:proofErr w:type="gramEnd"/>
+      <w:r>
+        <w:rPr>
+          <w:rFonts w:ascii="Times New Roman" w:hAnsi="Times New Roman" w:cs="Times New Roman"/>
+        </w:rPr>
+        <w:t xml:space="preserve"> distinguished between the mathematical existence of collisions and the practical difficulty of finding them. This distinction is important because saying only that "collisions exist" could incorrectly suggest that SHA-256 is automatically insecure.</w:t>
+      </w:r>
+    </w:p>
+    <w:p>
+      <w:pPr>
+        <w:spacing w:after="0"/>
+        <w:rPr>
+          <w:rFonts w:ascii="Times New Roman" w:hAnsi="Times New Roman" w:cs="Times New Roman"/>
+        </w:rPr>
+      </w:pPr>
+      <w:r>
+        <w:rPr>
+          <w:rFonts w:ascii="Times New Roman" w:hAnsi="Times New Roman" w:cs="Times New Roman"/>
+        </w:rPr>
+        <w:t>The explanation of the birthday effect was also correct. For an (n)-bit hash, generic collision searching requires work on the order of:</w:t>
+      </w:r>
+    </w:p>
+    <w:p>
+      <w:pPr>
+        <w:spacing w:after="0"/>
+        <w:rPr>
+          <w:rFonts w:ascii="Times New Roman" w:hAnsi="Times New Roman" w:cs="Times New Roman"/>
+        </w:rPr>
+      </w:pPr>
+      <w:r>
+        <w:rPr>
+          <w:rFonts w:ascii="Times New Roman" w:hAnsi="Times New Roman" w:cs="Times New Roman"/>
+        </w:rPr>
+        <w:t>[</w:t>
+      </w:r>
+      <w:r>
+        <w:rPr>
+          <w:rFonts w:ascii="Times New Roman" w:hAnsi="Times New Roman" w:cs="Times New Roman"/>
+        </w:rPr>
+        <w:br/>
+        <w:t>2^{n/2}</w:t>
+      </w:r>
+      <w:r>
+        <w:rPr>
+          <w:rFonts w:ascii="Times New Roman" w:hAnsi="Times New Roman" w:cs="Times New Roman"/>
+        </w:rPr>
+        <w:br/>
+        <w:t>]</w:t>
+      </w:r>
+    </w:p>
+    <w:p>
+      <w:pPr>
+        <w:spacing w:after="0"/>
+        <w:rPr>
+          <w:rFonts w:ascii="Times New Roman" w:hAnsi="Times New Roman" w:cs="Times New Roman"/>
+        </w:rPr>
+      </w:pPr>
+      <w:r>
+        <w:rPr>
+          <w:rFonts w:ascii="Times New Roman" w:hAnsi="Times New Roman" w:cs="Times New Roman"/>
+        </w:rPr>
+        <w:t>rather than (2^n). This matches what we studied regarding collision resistance and the birthday paradox.</w:t>
+      </w:r>
+    </w:p>
+    <w:p>
+      <w:pPr>
+        <w:spacing w:after="0"/>
+        <w:rPr>
+          <w:rFonts w:ascii="Times New Roman" w:hAnsi="Times New Roman" w:cs="Times New Roman"/>
+        </w:rPr>
+      </w:pPr>
+      <w:r>
+        <w:rPr>
+          <w:rFonts w:ascii="Times New Roman" w:hAnsi="Times New Roman" w:cs="Times New Roman"/>
+        </w:rPr>
+        <w:t>The Merkle tree explanation was clear and correctly stated that modifying one leaf changes the corresponding leaf hash, its ancestor hashes, and ultimately the Merkle root. It also correctly explained the rule used in our assignment when an odd number of nodes occurs: the last node is duplicated before calculating the next parent.</w:t>
+      </w:r>
+    </w:p>
+    <w:p>
+      <w:pPr>
+        <w:spacing w:after="0"/>
+        <w:rPr>
+          <w:rFonts w:ascii="Times New Roman" w:hAnsi="Times New Roman" w:cs="Times New Roman"/>
+        </w:rPr>
+      </w:pPr>
+      <w:r>
+        <w:rPr>
+          <w:rFonts w:ascii="Times New Roman" w:hAnsi="Times New Roman" w:cs="Times New Roman"/>
+        </w:rPr>
+        <w:t xml:space="preserve">The proof-of-work explanation was also accurate. It correctly connected the difficulty of finding a nonce to the unpredictability and avalanche behavior of cryptographic hash functions. A miner cannot normally determine the correct nonce directly from the target output. Instead, different nonces must be tested until one produces a qualifying </w:t>
+      </w:r>
+      <w:proofErr w:type="gramStart"/>
+      <w:r>
+        <w:rPr>
+          <w:rFonts w:ascii="Times New Roman" w:hAnsi="Times New Roman" w:cs="Times New Roman"/>
+        </w:rPr>
+        <w:t>hash</w:t>
+      </w:r>
+      <w:proofErr w:type="gramEnd"/>
+      <w:r>
+        <w:rPr>
+          <w:rFonts w:ascii="Times New Roman" w:hAnsi="Times New Roman" w:cs="Times New Roman"/>
+        </w:rPr>
+        <w:t>.</w:t>
+      </w:r>
+    </w:p>
+    <w:p>
+      <w:pPr>
+        <w:spacing w:after="0"/>
+        <w:rPr>
+          <w:rFonts w:ascii="Times New Roman" w:hAnsi="Times New Roman" w:cs="Times New Roman"/>
+        </w:rPr>
+      </w:pPr>
+      <w:r>
+        <w:rPr>
+          <w:rFonts w:ascii="Times New Roman" w:hAnsi="Times New Roman" w:cs="Times New Roman"/>
+        </w:rPr>
+        <w:lastRenderedPageBreak/>
+        <w:t>One simplification in the AI response is that statements such as (2^{128}) collision work or (2^d) proof-of-work attempts describe expected or generic cryptographic behavior rather than guaranteeing that every experiment will take exactly that many attempts. Our collision and proof-of-work experiments showed this clearly: individual trials can take fewer or more attempts because the process is probabilistic.</w:t>
+      </w:r>
+    </w:p>
+    <w:p>
+      <w:pPr>
+        <w:spacing w:after="0"/>
+        <w:rPr>
+          <w:rFonts w:ascii="Times New Roman" w:hAnsi="Times New Roman" w:cs="Times New Roman"/>
+          <w:b/>
+          <w:bCs/>
+        </w:rPr>
+      </w:pPr>
+    </w:p>
+    <w:p>
+      <w:pPr>
+        <w:spacing w:after="0"/>
+        <w:rPr>
+          <w:rFonts w:ascii="Times New Roman" w:hAnsi="Times New Roman" w:cs="Times New Roman"/>
+          <w:b/>
+          <w:bCs/>
+        </w:rPr>
+      </w:pPr>
+      <w:r>
+        <w:rPr>
+          <w:rFonts w:ascii="Times New Roman" w:hAnsi="Times New Roman" w:cs="Times New Roman"/>
+          <w:b/>
+          <w:bCs/>
+        </w:rPr>
+        <w:t>2. What aspects of the explanation were helpful?</w:t>
+      </w:r>
+    </w:p>
+    <w:p>
+      <w:pPr>
+        <w:spacing w:after="0"/>
+        <w:rPr>
+          <w:rFonts w:ascii="Times New Roman" w:hAnsi="Times New Roman" w:cs="Times New Roman"/>
+        </w:rPr>
+      </w:pPr>
+      <w:r>
+        <w:rPr>
+          <w:rFonts w:ascii="Times New Roman" w:hAnsi="Times New Roman" w:cs="Times New Roman"/>
+        </w:rPr>
+        <w:t>The most useful part of the AI explanation was that it connected mathematical concepts with practical security.</w:t>
+      </w:r>
+    </w:p>
+    <w:p>
+      <w:pPr>
+        <w:spacing w:after="0"/>
+        <w:rPr>
+          <w:rFonts w:ascii="Times New Roman" w:hAnsi="Times New Roman" w:cs="Times New Roman"/>
+        </w:rPr>
+      </w:pPr>
+      <w:r>
+        <w:rPr>
+          <w:rFonts w:ascii="Times New Roman" w:hAnsi="Times New Roman" w:cs="Times New Roman"/>
+        </w:rPr>
+        <w:t>For collisions, the AI clearly separated:</w:t>
+      </w:r>
+    </w:p>
+    <w:p>
+      <w:pPr>
+        <w:numPr>
+          <w:ilvl w:val="0"/>
+          <w:numId w:val="1"/>
+        </w:numPr>
+        <w:spacing w:after="0"/>
+        <w:rPr>
+          <w:rFonts w:ascii="Times New Roman" w:hAnsi="Times New Roman" w:cs="Times New Roman"/>
+        </w:rPr>
+      </w:pPr>
+      <w:r>
+        <w:rPr>
+          <w:rFonts w:ascii="Times New Roman" w:hAnsi="Times New Roman" w:cs="Times New Roman"/>
+        </w:rPr>
+        <w:t>collisions being mathematically unavoidable;</w:t>
+      </w:r>
+    </w:p>
+    <w:p>
+      <w:pPr>
+        <w:numPr>
+          <w:ilvl w:val="0"/>
+          <w:numId w:val="1"/>
+        </w:numPr>
+        <w:spacing w:after="0"/>
+        <w:rPr>
+          <w:rFonts w:ascii="Times New Roman" w:hAnsi="Times New Roman" w:cs="Times New Roman"/>
+        </w:rPr>
+      </w:pPr>
+      <w:r>
+        <w:rPr>
+          <w:rFonts w:ascii="Times New Roman" w:hAnsi="Times New Roman" w:cs="Times New Roman"/>
+        </w:rPr>
+        <w:t>collisions being computationally difficult to find.</w:t>
+      </w:r>
+    </w:p>
+    <w:p>
+      <w:pPr>
+        <w:spacing w:after="0"/>
+        <w:rPr>
+          <w:rFonts w:ascii="Times New Roman" w:hAnsi="Times New Roman" w:cs="Times New Roman"/>
+        </w:rPr>
+      </w:pPr>
+      <w:r>
+        <w:rPr>
+          <w:rFonts w:ascii="Times New Roman" w:hAnsi="Times New Roman" w:cs="Times New Roman"/>
+        </w:rPr>
+        <w:t>This helped explain why a finite-output hash function can still be secure.</w:t>
+      </w:r>
+    </w:p>
+    <w:p>
+      <w:pPr>
+        <w:spacing w:after="0"/>
+        <w:rPr>
+          <w:rFonts w:ascii="Times New Roman" w:hAnsi="Times New Roman" w:cs="Times New Roman"/>
+        </w:rPr>
+      </w:pPr>
+      <w:r>
+        <w:rPr>
+          <w:rFonts w:ascii="Times New Roman" w:hAnsi="Times New Roman" w:cs="Times New Roman"/>
+        </w:rPr>
+        <w:t xml:space="preserve">The Merkle tree explanation was useful because it described how a local modification propagates upward through the tree. This matches what we observed experimentally when modifying one file: the modified leaf </w:t>
+      </w:r>
+      <w:proofErr w:type="gramStart"/>
+      <w:r>
+        <w:rPr>
+          <w:rFonts w:ascii="Times New Roman" w:hAnsi="Times New Roman" w:cs="Times New Roman"/>
+        </w:rPr>
+        <w:t>hash</w:t>
+      </w:r>
+      <w:proofErr w:type="gramEnd"/>
+      <w:r>
+        <w:rPr>
+          <w:rFonts w:ascii="Times New Roman" w:hAnsi="Times New Roman" w:cs="Times New Roman"/>
+        </w:rPr>
+        <w:t xml:space="preserve"> changed, its parent changed, and the final root changed, while unrelated branches remained unchanged.</w:t>
+      </w:r>
+    </w:p>
+    <w:p>
+      <w:pPr>
+        <w:spacing w:after="0"/>
+        <w:rPr>
+          <w:rFonts w:ascii="Times New Roman" w:hAnsi="Times New Roman" w:cs="Times New Roman"/>
+        </w:rPr>
+      </w:pPr>
+      <w:r>
+        <w:rPr>
+          <w:rFonts w:ascii="Times New Roman" w:hAnsi="Times New Roman" w:cs="Times New Roman"/>
+        </w:rPr>
+        <w:t>The proof-of-work explanation was also helpful because it explained the asymmetry between solving and verification. Finding a valid nonce may require many hash calculations, but verifying an already discovered nonce requires only one calculation. This makes the reason proof-of-work can be used as a computational puzzle easy to understand.</w:t>
+      </w:r>
+    </w:p>
+    <w:p>
+      <w:pPr>
+        <w:spacing w:after="0"/>
+        <w:rPr>
+          <w:rFonts w:ascii="Times New Roman" w:hAnsi="Times New Roman" w:cs="Times New Roman"/>
+        </w:rPr>
+      </w:pPr>
+      <w:r>
+        <w:rPr>
+          <w:rFonts w:ascii="Times New Roman" w:hAnsi="Times New Roman" w:cs="Times New Roman"/>
+        </w:rPr>
+        <w:t>The equations provided by the AI were also useful because they connected the written explanations to the mathematical relationships studied in class.</w:t>
+      </w:r>
+    </w:p>
+    <w:p>
+      <w:pPr>
+        <w:spacing w:after="0"/>
+        <w:rPr>
+          <w:rFonts w:ascii="Times New Roman" w:hAnsi="Times New Roman" w:cs="Times New Roman"/>
+          <w:b/>
+          <w:bCs/>
+        </w:rPr>
+      </w:pPr>
+    </w:p>
+    <w:p>
+      <w:pPr>
+        <w:spacing w:after="0"/>
+        <w:rPr>
+          <w:rFonts w:ascii="Times New Roman" w:hAnsi="Times New Roman" w:cs="Times New Roman"/>
+          <w:b/>
+          <w:bCs/>
+        </w:rPr>
+      </w:pPr>
+      <w:r>
+        <w:rPr>
+          <w:rFonts w:ascii="Times New Roman" w:hAnsi="Times New Roman" w:cs="Times New Roman"/>
+          <w:b/>
+          <w:bCs/>
+        </w:rPr>
+        <w:t>3. In what ways might cryptographic techniques help improve trust in AI systems?</w:t>
+      </w:r>
+    </w:p>
+    <w:p>
+      <w:pPr>
+        <w:spacing w:after="0"/>
+        <w:rPr>
+          <w:rFonts w:ascii="Times New Roman" w:hAnsi="Times New Roman" w:cs="Times New Roman"/>
+        </w:rPr>
+      </w:pPr>
+      <w:r>
+        <w:rPr>
+          <w:rFonts w:ascii="Times New Roman" w:hAnsi="Times New Roman" w:cs="Times New Roman"/>
+        </w:rPr>
+        <w:t>Cryptographic techniques can improve trust in AI systems by helping users verify the integrity, origin, and authenticity of information.</w:t>
+      </w:r>
+    </w:p>
+    <w:p>
+      <w:pPr>
+        <w:spacing w:after="0"/>
+        <w:rPr>
+          <w:rFonts w:ascii="Times New Roman" w:hAnsi="Times New Roman" w:cs="Times New Roman"/>
+        </w:rPr>
+      </w:pPr>
+      <w:r>
+        <w:rPr>
+          <w:rFonts w:ascii="Times New Roman" w:hAnsi="Times New Roman" w:cs="Times New Roman"/>
+        </w:rPr>
+        <w:t>Cryptographic hashes can verify that an AI model, dataset, configuration file, or generated artifact has not been modified after an approved version was published. If the stored hash and newly computed hash do not match, the change can be detected.</w:t>
+      </w:r>
+    </w:p>
+    <w:p>
+      <w:pPr>
+        <w:spacing w:after="0"/>
+        <w:rPr>
+          <w:rFonts w:ascii="Times New Roman" w:hAnsi="Times New Roman" w:cs="Times New Roman"/>
+        </w:rPr>
+      </w:pPr>
+      <w:r>
+        <w:rPr>
+          <w:rFonts w:ascii="Times New Roman" w:hAnsi="Times New Roman" w:cs="Times New Roman"/>
+        </w:rPr>
+        <w:t>Digital signatures can provide stronger origin authentication. An organization could digitally sign an approved AI model or software release so that users can verify that the file was published by the expected organization and has not been altered.</w:t>
+      </w:r>
+    </w:p>
+    <w:p>
+      <w:pPr>
+        <w:spacing w:after="0"/>
+        <w:rPr>
+          <w:rFonts w:ascii="Times New Roman" w:hAnsi="Times New Roman" w:cs="Times New Roman"/>
+        </w:rPr>
+      </w:pPr>
+      <w:r>
+        <w:rPr>
+          <w:rFonts w:ascii="Times New Roman" w:hAnsi="Times New Roman" w:cs="Times New Roman"/>
+        </w:rPr>
+        <w:t>Merkle trees could also be useful when a system needs to verify the integrity of a very large collection of records or data objects without checking every item individually. A trusted Merkle root can represent the integrity state of an entire dataset, while a Merkle proof can verify an individual item.</w:t>
+      </w:r>
+    </w:p>
+    <w:p>
+      <w:pPr>
+        <w:spacing w:after="0"/>
+        <w:rPr>
+          <w:rFonts w:ascii="Times New Roman" w:hAnsi="Times New Roman" w:cs="Times New Roman"/>
+        </w:rPr>
+      </w:pPr>
+      <w:r>
+        <w:rPr>
+          <w:rFonts w:ascii="Times New Roman" w:hAnsi="Times New Roman" w:cs="Times New Roman"/>
+        </w:rPr>
+        <w:t xml:space="preserve">These techniques cannot determine whether an AI answer is logically correct or free from bias. However, they can provide evidence about where data came from, whether it has been modified, and whether a particular artifact was produced or approved by an authenticated source. </w:t>
+      </w:r>
+      <w:r>
+        <w:rPr>
+          <w:rFonts w:ascii="Times New Roman" w:hAnsi="Times New Roman" w:cs="Times New Roman"/>
+        </w:rPr>
+        <w:lastRenderedPageBreak/>
+        <w:t>Cryptography therefore improves technical trust and integrity even though human evaluation is still necessary for the meaning and correctness of AI-generated content.</w:t>
+      </w:r>
+    </w:p>
+    <w:p>
+      <w:pPr>
+        <w:spacing w:after="0"/>
+        <w:rPr>
+          <w:rFonts w:ascii="Times New Roman" w:hAnsi="Times New Roman" w:cs="Times New Roman"/>
+          <w:b/>
+          <w:bCs/>
+        </w:rPr>
+      </w:pPr>
+    </w:p>
+    <w:p>
+      <w:pPr>
+        <w:spacing w:after="0"/>
+        <w:rPr>
+          <w:rFonts w:ascii="Times New Roman" w:hAnsi="Times New Roman" w:cs="Times New Roman"/>
+          <w:b/>
+          <w:bCs/>
+        </w:rPr>
+      </w:pPr>
+      <w:r>
+        <w:rPr>
+          <w:rFonts w:ascii="Times New Roman" w:hAnsi="Times New Roman" w:cs="Times New Roman"/>
+          <w:b/>
+          <w:bCs/>
+        </w:rPr>
+        <w:t>4. Conversely, how might AI tools assist in studying or analyzing cryptographic systems?</w:t>
+      </w:r>
+    </w:p>
+    <w:p>
+      <w:pPr>
+        <w:spacing w:after="0"/>
+        <w:rPr>
+          <w:rFonts w:ascii="Times New Roman" w:hAnsi="Times New Roman" w:cs="Times New Roman"/>
+        </w:rPr>
+      </w:pPr>
+      <w:r>
+        <w:rPr>
+          <w:rFonts w:ascii="Times New Roman" w:hAnsi="Times New Roman" w:cs="Times New Roman"/>
+        </w:rPr>
+        <w:t>AI tools can assist students and security professionals by explaining difficult cryptographic concepts, generating examples, helping interpret experimental results, and reviewing code for possible mistakes.</w:t>
+      </w:r>
+    </w:p>
+    <w:p>
+      <w:pPr>
+        <w:spacing w:after="0"/>
+        <w:rPr>
+          <w:rFonts w:ascii="Times New Roman" w:hAnsi="Times New Roman" w:cs="Times New Roman"/>
+        </w:rPr>
+      </w:pPr>
+      <w:r>
+        <w:rPr>
+          <w:rFonts w:ascii="Times New Roman" w:hAnsi="Times New Roman" w:cs="Times New Roman"/>
+        </w:rPr>
+        <w:t>In this project, AI was useful for explaining why collisions are inevitable, why the birthday paradox reduces generic collision complexity to roughly (2^{n/</w:t>
+      </w:r>
+      <w:proofErr w:type="gramStart"/>
+      <w:r>
+        <w:rPr>
+          <w:rFonts w:ascii="Times New Roman" w:hAnsi="Times New Roman" w:cs="Times New Roman"/>
+        </w:rPr>
+        <w:t>2})</w:t>
+      </w:r>
+      <w:proofErr w:type="gramEnd"/>
+      <w:r>
+        <w:rPr>
+          <w:rFonts w:ascii="Times New Roman" w:hAnsi="Times New Roman" w:cs="Times New Roman"/>
+        </w:rPr>
+        <w:t>, how changes propagate through Merkle trees, and why proof-of-work requires repeated trial-and-error hashing.</w:t>
+      </w:r>
+    </w:p>
+    <w:p>
+      <w:pPr>
+        <w:spacing w:after="0"/>
+        <w:rPr>
+          <w:rFonts w:ascii="Times New Roman" w:hAnsi="Times New Roman" w:cs="Times New Roman"/>
+        </w:rPr>
+      </w:pPr>
+      <w:r>
+        <w:rPr>
+          <w:rFonts w:ascii="Times New Roman" w:hAnsi="Times New Roman" w:cs="Times New Roman"/>
+        </w:rPr>
+        <w:t>AI can also help generate test cases and identify areas of code that deserve additional review. For example, an AI tool could suggest testing a Merkle tree with an odd number of leaves, checking whether two distinct inputs produced a reported collision, or comparing observed collision counts with theoretical expectations.</w:t>
+      </w:r>
+    </w:p>
+    <w:p>
+      <w:pPr>
+        <w:spacing w:after="0"/>
+        <w:rPr>
+          <w:rFonts w:ascii="Times New Roman" w:hAnsi="Times New Roman" w:cs="Times New Roman"/>
+        </w:rPr>
+      </w:pPr>
+      <w:r>
+        <w:rPr>
+          <w:rFonts w:ascii="Times New Roman" w:hAnsi="Times New Roman" w:cs="Times New Roman"/>
+        </w:rPr>
+        <w:t xml:space="preserve">However, AI-generated cryptography explanations and code should not be accepted automatically. Cryptographic mistakes can be subtle, and an explanation may sound convincing even when an assumption is incorrect. Our approach was therefore to use AI as an assistant rather than as the final authority. We compared its explanations with the course material, the mathematical properties of hash functions, and the </w:t>
+      </w:r>
+      <w:proofErr w:type="gramStart"/>
+      <w:r>
+        <w:rPr>
+          <w:rFonts w:ascii="Times New Roman" w:hAnsi="Times New Roman" w:cs="Times New Roman"/>
+        </w:rPr>
+        <w:t>outputs</w:t>
+      </w:r>
+      <w:proofErr w:type="gramEnd"/>
+      <w:r>
+        <w:rPr>
+          <w:rFonts w:ascii="Times New Roman" w:hAnsi="Times New Roman" w:cs="Times New Roman"/>
+        </w:rPr>
+        <w:t xml:space="preserve"> produced by our own experiments.</w:t>
+      </w:r>
+    </w:p>
+    <w:p>
+      <w:pPr>
+        <w:spacing w:after="0"/>
+        <w:rPr>
+          <w:rFonts w:ascii="Times New Roman" w:hAnsi="Times New Roman" w:cs="Times New Roman"/>
+          <w:b/>
+          <w:bCs/>
+        </w:rPr>
+      </w:pPr>
+    </w:p>
+    <w:p>
+      <w:pPr>
+        <w:spacing w:after="0"/>
+        <w:rPr>
+          <w:rFonts w:ascii="Times New Roman" w:hAnsi="Times New Roman" w:cs="Times New Roman"/>
+          <w:b/>
+          <w:bCs/>
+        </w:rPr>
+      </w:pPr>
+      <w:r>
+        <w:rPr>
+          <w:rFonts w:ascii="Times New Roman" w:hAnsi="Times New Roman" w:cs="Times New Roman"/>
+          <w:b/>
+          <w:bCs/>
+        </w:rPr>
+        <w:t>Part IV Conclusion</w:t>
+      </w:r>
+    </w:p>
+    <w:p>
+      <w:pPr>
+        <w:spacing w:after="0"/>
+        <w:rPr>
+          <w:rFonts w:ascii="Times New Roman" w:hAnsi="Times New Roman" w:cs="Times New Roman"/>
+        </w:rPr>
+      </w:pPr>
+      <w:r>
+        <w:rPr>
+          <w:rFonts w:ascii="Times New Roman" w:hAnsi="Times New Roman" w:cs="Times New Roman"/>
+        </w:rPr>
+        <w:t>The AI responses were useful and generally accurate, but this exercise demonstrated why human verification remains important when AI is used for cryptography. The strongest use of AI in this context is as a learning and analysis aid: it can explain concepts, suggest tests, and help organize reasoning, but its claims should still be checked against cryptographic principles and experimental evidence.</w:t>
+      </w:r>
+    </w:p>
+    <w:p>
+      <w:pPr>
+        <w:spacing w:after="0"/>
+        <w:rPr>
+          <w:rFonts w:ascii="Times New Roman" w:hAnsi="Times New Roman" w:cs="Times New Roman"/>
+        </w:rPr>
+      </w:pPr>
+      <w:r>
+        <w:rPr>
+          <w:rFonts w:ascii="Times New Roman" w:hAnsi="Times New Roman" w:cs="Times New Roman"/>
+        </w:rPr>
+        <w:t>At the same time, cryptographic techniques such as hashing, digital signatures, and authenticated data structures can improve confidence in the integrity and origin of AI-related data and software. The combination of cryptography, AI assistance, and human verification provides a stronger approach than relying on any one of these mechanisms by itself.</w:t>
+      </w:r>
+    </w:p>
+    <w:p>
+      <w:pPr>
+        <w:spacing w:after="0"/>
+        <w:rPr>
+          <w:rFonts w:ascii="Times New Roman" w:hAnsi="Times New Roman" w:cs="Times New Roman"/>
+        </w:rPr>
+      </w:pPr>
     </w:p>
     <w:sectPr>
       <w:pgSz w:w="12240" w:h="15840"/>
@@ -798,6 +2473,163 @@
     </w:sectPr>
   </w:body>
 </w:document>
+</file>
+
+<file path=word/numbering.xml><?xml version="1.0" encoding="utf-8"?>
+<w:numbering xmlns:wpc="http://schemas.microsoft.com/office/word/2010/wordprocessingCanvas" xmlns:cx="http://schemas.microsoft.com/office/drawing/2014/chartex" xmlns:cx1="http://schemas.microsoft.com/office/drawing/2015/9/8/chartex" xmlns:cx2="http://schemas.microsoft.com/office/drawing/2015/10/21/chartex" xmlns:cx3="http://schemas.microsoft.com/office/drawing/2016/5/9/chartex" xmlns:cx4="http://schemas.microsoft.com/office/drawing/2016/5/10/chartex" xmlns:cx5="http://schemas.microsoft.com/office/drawing/2016/5/11/chartex" xmlns:cx6="http://schemas.microsoft.com/office/drawing/2016/5/12/chartex" xmlns:cx7="http://schemas.microsoft.com/office/drawing/2016/5/13/chartex" xmlns:cx8="http://schemas.microsoft.com/office/drawing/2016/5/14/chartex" xmlns:mc="http://schemas.openxmlformats.org/markup-compatibility/2006" xmlns:aink="http://schemas.microsoft.com/office/drawing/2016/ink" xmlns:am3d="http://schemas.microsoft.com/office/drawing/2017/model3d" xmlns:o="urn:schemas-microsoft-com:office:office" xmlns:oel="http://schemas.microsoft.com/office/2019/extlst" xmlns:r="http://schemas.openxmlformats.org/officeDocument/2006/relationships" xmlns:m="http://schemas.openxmlformats.org/officeDocument/2006/math" xmlns:v="urn:schemas-microsoft-com:vml" xmlns:wp14="http://schemas.microsoft.com/office/word/2010/wordprocessingDrawing" xmlns:wp="http://schemas.openxmlformats.org/drawingml/2006/wordprocessingDrawing" xmlns:w10="urn:schemas-microsoft-com:office:word" xmlns:w="http://schemas.openxmlformats.org/wordprocessingml/2006/main" xmlns:w14="http://schemas.microsoft.com/office/word/2010/wordml" xmlns:w15="http://schemas.microsoft.com/office/word/2012/wordml" xmlns:w16cex="http://schemas.microsoft.com/office/word/2018/wordml/cex" xmlns:w16cid="http://schemas.microsoft.com/office/word/2016/wordml/cid" xmlns:w16="http://schemas.microsoft.com/office/word/2018/wordml" xmlns:w16du="http://schemas.microsoft.com/office/word/2023/wordml/word16du" xmlns:w16sdtdh="http://schemas.microsoft.com/office/word/2020/wordml/sdtdatahash" xmlns:w16sdtfl="http://schemas.microsoft.com/office/word/2024/wordml/sdtformatlock" xmlns:w16se="http://schemas.microsoft.com/office/word/2015/wordml/symex" xmlns:wpg="http://schemas.microsoft.com/office/word/2010/wordprocessingGroup" xmlns:wpi="http://schemas.microsoft.com/office/word/2010/wordprocessingInk" xmlns:wne="http://schemas.microsoft.com/office/word/2006/wordml" xmlns:wps="http://schemas.microsoft.com/office/word/2010/wordprocessingShape" mc:Ignorable="w14 w15 w16se w16cid w16 w16cex w16sdtdh w16sdtfl w16du wp14">
+  <w:abstractNum w:abstractNumId="0" w15:restartNumberingAfterBreak="0">
+    <w:nsid w:val="2DD57E11"/>
+    <w:multiLevelType w:val="multilevel"/>
+    <w:tmpl w:val="3ECA3164"/>
+    <w:lvl w:ilvl="0">
+      <w:start w:val="1"/>
+      <w:numFmt w:val="bullet"/>
+      <w:lvlText w:val=""/>
+      <w:lvlJc w:val="left"/>
+      <w:pPr>
+        <w:tabs>
+          <w:tab w:val="num" w:pos="720"/>
+        </w:tabs>
+        <w:ind w:left="720" w:hanging="360"/>
+      </w:pPr>
+      <w:rPr>
+        <w:rFonts w:ascii="Symbol" w:hAnsi="Symbol" w:hint="default"/>
+        <w:sz w:val="20"/>
+      </w:rPr>
+    </w:lvl>
+    <w:lvl w:ilvl="1" w:tentative="1">
+      <w:start w:val="1"/>
+      <w:numFmt w:val="bullet"/>
+      <w:lvlText w:val="o"/>
+      <w:lvlJc w:val="left"/>
+      <w:pPr>
+        <w:tabs>
+          <w:tab w:val="num" w:pos="1440"/>
+        </w:tabs>
+        <w:ind w:left="1440" w:hanging="360"/>
+      </w:pPr>
+      <w:rPr>
+        <w:rFonts w:ascii="Courier New" w:hAnsi="Courier New" w:hint="default"/>
+        <w:sz w:val="20"/>
+      </w:rPr>
+    </w:lvl>
+    <w:lvl w:ilvl="2" w:tentative="1">
+      <w:start w:val="1"/>
+      <w:numFmt w:val="bullet"/>
+      <w:lvlText w:val=""/>
+      <w:lvlJc w:val="left"/>
+      <w:pPr>
+        <w:tabs>
+          <w:tab w:val="num" w:pos="2160"/>
+        </w:tabs>
+        <w:ind w:left="2160" w:hanging="360"/>
+      </w:pPr>
+      <w:rPr>
+        <w:rFonts w:ascii="Wingdings" w:hAnsi="Wingdings" w:hint="default"/>
+        <w:sz w:val="20"/>
+      </w:rPr>
+    </w:lvl>
+    <w:lvl w:ilvl="3" w:tentative="1">
+      <w:start w:val="1"/>
+      <w:numFmt w:val="bullet"/>
+      <w:lvlText w:val=""/>
+      <w:lvlJc w:val="left"/>
+      <w:pPr>
+        <w:tabs>
+          <w:tab w:val="num" w:pos="2880"/>
+        </w:tabs>
+        <w:ind w:left="2880" w:hanging="360"/>
+      </w:pPr>
+      <w:rPr>
+        <w:rFonts w:ascii="Wingdings" w:hAnsi="Wingdings" w:hint="default"/>
+        <w:sz w:val="20"/>
+      </w:rPr>
+    </w:lvl>
+    <w:lvl w:ilvl="4" w:tentative="1">
+      <w:start w:val="1"/>
+      <w:numFmt w:val="bullet"/>
+      <w:lvlText w:val=""/>
+      <w:lvlJc w:val="left"/>
+      <w:pPr>
+        <w:tabs>
+          <w:tab w:val="num" w:pos="3600"/>
+        </w:tabs>
+        <w:ind w:left="3600" w:hanging="360"/>
+      </w:pPr>
+      <w:rPr>
+        <w:rFonts w:ascii="Wingdings" w:hAnsi="Wingdings" w:hint="default"/>
+        <w:sz w:val="20"/>
+      </w:rPr>
+    </w:lvl>
+    <w:lvl w:ilvl="5" w:tentative="1">
+      <w:start w:val="1"/>
+      <w:numFmt w:val="bullet"/>
+      <w:lvlText w:val=""/>
+      <w:lvlJc w:val="left"/>
+      <w:pPr>
+        <w:tabs>
+          <w:tab w:val="num" w:pos="4320"/>
+        </w:tabs>
+        <w:ind w:left="4320" w:hanging="360"/>
+      </w:pPr>
+      <w:rPr>
+        <w:rFonts w:ascii="Wingdings" w:hAnsi="Wingdings" w:hint="default"/>
+        <w:sz w:val="20"/>
+      </w:rPr>
+    </w:lvl>
+    <w:lvl w:ilvl="6" w:tentative="1">
+      <w:start w:val="1"/>
+      <w:numFmt w:val="bullet"/>
+      <w:lvlText w:val=""/>
+      <w:lvlJc w:val="left"/>
+      <w:pPr>
+        <w:tabs>
+          <w:tab w:val="num" w:pos="5040"/>
+        </w:tabs>
+        <w:ind w:left="5040" w:hanging="360"/>
+      </w:pPr>
+      <w:rPr>
+        <w:rFonts w:ascii="Wingdings" w:hAnsi="Wingdings" w:hint="default"/>
+        <w:sz w:val="20"/>
+      </w:rPr>
+    </w:lvl>
+    <w:lvl w:ilvl="7" w:tentative="1">
+      <w:start w:val="1"/>
+      <w:numFmt w:val="bullet"/>
+      <w:lvlText w:val=""/>
+      <w:lvlJc w:val="left"/>
+      <w:pPr>
+        <w:tabs>
+          <w:tab w:val="num" w:pos="5760"/>
+        </w:tabs>
+        <w:ind w:left="5760" w:hanging="360"/>
+      </w:pPr>
+      <w:rPr>
+        <w:rFonts w:ascii="Wingdings" w:hAnsi="Wingdings" w:hint="default"/>
+        <w:sz w:val="20"/>
+      </w:rPr>
+    </w:lvl>
+    <w:lvl w:ilvl="8" w:tentative="1">
+      <w:start w:val="1"/>
+      <w:numFmt w:val="bullet"/>
+      <w:lvlText w:val=""/>
+      <w:lvlJc w:val="left"/>
+      <w:pPr>
+        <w:tabs>
+          <w:tab w:val="num" w:pos="6480"/>
+        </w:tabs>
+        <w:ind w:left="6480" w:hanging="360"/>
+      </w:pPr>
+      <w:rPr>
+        <w:rFonts w:ascii="Wingdings" w:hAnsi="Wingdings" w:hint="default"/>
+        <w:sz w:val="20"/>
+      </w:rPr>
+    </w:lvl>
+  </w:abstractNum>
+  <w:num w:numId="1" w16cid:durableId="286283093">
+    <w:abstractNumId w:val="0"/>
+  </w:num>
+</w:numbering>
 </file>
 
 <file path=word/styles.xml><?xml version="1.0" encoding="utf-8"?>
@@ -1403,6 +3235,7 @@
   <w:style w:type="character" w:default="1" w:styleId="DefaultParagraphFont">
     <w:name w:val="Default Paragraph Font"/>
     <w:uiPriority w:val="1"/>
+    <w:semiHidden/>
     <w:unhideWhenUsed/>
   </w:style>
   <w:style w:type="table" w:default="1" w:styleId="TableNormal">
@@ -2165,20 +3998,20 @@
 </file>
 
 <file path=customXml/item2.xml><?xml version="1.0" encoding="utf-8"?>
+<p:properties xmlns:p="http://schemas.microsoft.com/office/2006/metadata/properties" xmlns:xsi="http://www.w3.org/2001/XMLSchema-instance" xmlns:pc="http://schemas.microsoft.com/office/infopath/2007/PartnerControls">
+  <documentManagement>
+    <_activity xmlns="b9afb6a5-5a5e-4168-88e0-90f4275f4ff4" xsi:nil="true"/>
+  </documentManagement>
+</p:properties>
+</file>
+
+<file path=customXml/item3.xml><?xml version="1.0" encoding="utf-8"?>
 <?mso-contentType ?>
 <FormTemplates xmlns="http://schemas.microsoft.com/sharepoint/v3/contenttype/forms">
   <Display>DocumentLibraryForm</Display>
   <Edit>DocumentLibraryForm</Edit>
   <New>DocumentLibraryForm</New>
 </FormTemplates>
-</file>
-
-<file path=customXml/item3.xml><?xml version="1.0" encoding="utf-8"?>
-<p:properties xmlns:p="http://schemas.microsoft.com/office/2006/metadata/properties" xmlns:xsi="http://www.w3.org/2001/XMLSchema-instance" xmlns:pc="http://schemas.microsoft.com/office/infopath/2007/PartnerControls">
-  <documentManagement>
-    <_activity xmlns="b9afb6a5-5a5e-4168-88e0-90f4275f4ff4" xsi:nil="true"/>
-  </documentManagement>
-</p:properties>
 </file>
 
 <file path=customXml/itemProps1.xml><?xml version="1.0" encoding="utf-8"?>
@@ -2200,14 +4033,6 @@
 </file>
 
 <file path=customXml/itemProps2.xml><?xml version="1.0" encoding="utf-8"?>
-<ds:datastoreItem xmlns:ds="http://schemas.openxmlformats.org/officeDocument/2006/customXml" ds:itemID="{37BC2457-4942-4738-991B-91BA78339960}">
-  <ds:schemaRefs>
-    <ds:schemaRef ds:uri="http://schemas.microsoft.com/sharepoint/v3/contenttype/forms"/>
-  </ds:schemaRefs>
-</ds:datastoreItem>
-</file>
-
-<file path=customXml/itemProps3.xml><?xml version="1.0" encoding="utf-8"?>
 <ds:datastoreItem xmlns:ds="http://schemas.openxmlformats.org/officeDocument/2006/customXml" ds:itemID="{3D6AB64D-547C-4BF0-939B-6C1AB4B4CBEC}">
   <ds:schemaRefs>
     <ds:schemaRef ds:uri="http://schemas.microsoft.com/office/2006/metadata/properties"/>
@@ -2215,4 +4040,12 @@
     <ds:schemaRef ds:uri="b9afb6a5-5a5e-4168-88e0-90f4275f4ff4"/>
   </ds:schemaRefs>
 </ds:datastoreItem>
+</file>
+
+<file path=customXml/itemProps3.xml><?xml version="1.0" encoding="utf-8"?>
+<ds:datastoreItem xmlns:ds="http://schemas.openxmlformats.org/officeDocument/2006/customXml" ds:itemID="{37BC2457-4942-4738-991B-91BA78339960}">
+  <ds:schemaRefs>
+    <ds:schemaRef ds:uri="http://schemas.microsoft.com/sharepoint/v3/contenttype/forms"/>
+  </ds:schemaRefs>
+</ds:datastoreItem>
 </file>
</xml_diff>